<commit_message>
removed supp figures. added alphafold and amphiscan
</commit_message>
<xml_diff>
--- a/manuscript/Cover_Letter_Oren_et_al_PlantPhys.docx
+++ b/manuscript/Cover_Letter_Oren_et_al_PlantPhys.docx
@@ -224,18 +224,57 @@
           <w:ilvl w:val="0"/>
           <w:numId w:val="1"/>
         </w:numPr>
+        <w:spacing w:after="0" w:afterAutospacing="0" w:before="0" w:beforeAutospacing="0" w:lineRule="auto"/>
+        <w:ind w:left="720" w:hanging="360"/>
+        <w:rPr/>
+      </w:pPr>
+      <w:r>
+        <w:rPr>
+          <w:rFonts w:ascii="Times New Roman" w:cs="Times New Roman" w:eastAsia="Times New Roman" w:hAnsi="Times New Roman"/>
+          <w:sz w:val="24"/>
+          <w:szCs w:val="24"/>
+          <w:rtl w:val="0"/>
+        </w:rPr>
+        <w:t xml:space="preserve">Our structural analysis of LEA3 reveals a 15-amino-acid insertion in cold-sensitive maize that disrupts its conserved amphipathic helix, pinpointing a molecular basis for differential freezing toleranc</w:t>
+      </w:r>
+      <w:r>
+        <w:rPr>
+          <w:rFonts w:ascii="Times New Roman" w:cs="Times New Roman" w:eastAsia="Times New Roman" w:hAnsi="Times New Roman"/>
+          <w:sz w:val="24"/>
+          <w:szCs w:val="24"/>
+          <w:rtl w:val="0"/>
+        </w:rPr>
+        <w:t xml:space="preserve">e.</w:t>
+      </w:r>
+      <w:r>
+        <w:rPr>
+          <w:rtl w:val="0"/>
+        </w:rPr>
+      </w:r>
+    </w:p>
+    <w:p>
+      <w:pPr>
+        <w:numPr>
+          <w:ilvl w:val="0"/>
+          <w:numId w:val="1"/>
+        </w:numPr>
         <w:spacing w:after="240" w:before="0" w:beforeAutospacing="0" w:lineRule="auto"/>
         <w:ind w:left="720" w:hanging="360"/>
-        <w:rPr/>
-      </w:pPr>
-      <w:r>
-        <w:rPr>
-          <w:rFonts w:ascii="Times New Roman" w:cs="Times New Roman" w:eastAsia="Times New Roman" w:hAnsi="Times New Roman"/>
-          <w:sz w:val="24"/>
-          <w:szCs w:val="24"/>
-          <w:rtl w:val="0"/>
-        </w:rPr>
-        <w:t xml:space="preserve">Our structural analysis of LEA3 reveals a 15-amino-acid insertion in cold-sensitive maize that disrupts its conserved amphipathic helix, pinpointing a molecular basis for differential freezing tolerance.</w:t>
+        <w:rPr>
+          <w:rFonts w:ascii="Times New Roman" w:cs="Times New Roman" w:eastAsia="Times New Roman" w:hAnsi="Times New Roman"/>
+          <w:sz w:val="24"/>
+          <w:szCs w:val="24"/>
+          <w:u w:val="none"/>
+        </w:rPr>
+      </w:pPr>
+      <w:r>
+        <w:rPr>
+          <w:rFonts w:ascii="Times New Roman" w:cs="Times New Roman" w:eastAsia="Times New Roman" w:hAnsi="Times New Roman"/>
+          <w:sz w:val="24"/>
+          <w:szCs w:val="24"/>
+          <w:rtl w:val="0"/>
+        </w:rPr>
+        <w:t xml:space="preserve">This rich proteomic dataset is a resource that can be mined to answer many other  questions beyond freezing tolerance.</w:t>
       </w:r>
     </w:p>
     <w:p>

</xml_diff>